<commit_message>
Add Mapstruct, fix build and deploy scripta. Fix maven profiles for build and deployments to docker
</commit_message>
<xml_diff>
--- a/doc/user-manual.docx
+++ b/doc/user-manual.docx
@@ -1,6 +1,6 @@
 
 <file path=word/document.xml><?xml version="1.0" encoding="utf-8"?>
-<w:document xmlns:wpc="http://schemas.microsoft.com/office/word/2010/wordprocessingCanvas" xmlns:cx="http://schemas.microsoft.com/office/drawing/2014/chartex" xmlns:cx1="http://schemas.microsoft.com/office/drawing/2015/9/8/chartex" xmlns:cx2="http://schemas.microsoft.com/office/drawing/2015/10/21/chartex" xmlns:cx3="http://schemas.microsoft.com/office/drawing/2016/5/9/chartex" xmlns:cx4="http://schemas.microsoft.com/office/drawing/2016/5/10/chartex" xmlns:cx5="http://schemas.microsoft.com/office/drawing/2016/5/11/chartex" xmlns:cx6="http://schemas.microsoft.com/office/drawing/2016/5/12/chartex" xmlns:cx7="http://schemas.microsoft.com/office/drawing/2016/5/13/chartex" xmlns:cx8="http://schemas.microsoft.com/office/drawing/2016/5/14/chartex" xmlns:mc="http://schemas.openxmlformats.org/markup-compatibility/2006" xmlns:aink="http://schemas.microsoft.com/office/drawing/2016/ink" xmlns:am3d="http://schemas.microsoft.com/office/drawing/2017/model3d" xmlns:o="urn:schemas-microsoft-com:office:office" xmlns:oel="http://schemas.microsoft.com/office/2019/extlst" xmlns:r="http://schemas.openxmlformats.org/officeDocument/2006/relationships" xmlns:m="http://schemas.openxmlformats.org/officeDocument/2006/math" xmlns:v="urn:schemas-microsoft-com:vml" xmlns:wp14="http://schemas.microsoft.com/office/word/2010/wordprocessingDrawing" xmlns:wp="http://schemas.openxmlformats.org/drawingml/2006/wordprocessingDrawing" xmlns:w10="urn:schemas-microsoft-com:office:word" xmlns:w="http://schemas.openxmlformats.org/wordprocessingml/2006/main" xmlns:w14="http://schemas.microsoft.com/office/word/2010/wordml" xmlns:w15="http://schemas.microsoft.com/office/word/2012/wordml" xmlns:w16cex="http://schemas.microsoft.com/office/word/2018/wordml/cex" xmlns:w16cid="http://schemas.microsoft.com/office/word/2016/wordml/cid" xmlns:w16="http://schemas.microsoft.com/office/word/2018/wordml" xmlns:w16sdtdh="http://schemas.microsoft.com/office/word/2020/wordml/sdtdatahash" xmlns:w16se="http://schemas.microsoft.com/office/word/2015/wordml/symex" xmlns:wpg="http://schemas.microsoft.com/office/word/2010/wordprocessingGroup" xmlns:wpi="http://schemas.microsoft.com/office/word/2010/wordprocessingInk" xmlns:wne="http://schemas.microsoft.com/office/word/2006/wordml" xmlns:wps="http://schemas.microsoft.com/office/word/2010/wordprocessingShape" mc:Ignorable="w14 w15 w16se w16cid w16 w16cex w16sdtdh wp14">
+<w:document xmlns:wpc="http://schemas.microsoft.com/office/word/2010/wordprocessingCanvas" xmlns:cx="http://schemas.microsoft.com/office/drawing/2014/chartex" xmlns:cx1="http://schemas.microsoft.com/office/drawing/2015/9/8/chartex" xmlns:cx2="http://schemas.microsoft.com/office/drawing/2015/10/21/chartex" xmlns:cx3="http://schemas.microsoft.com/office/drawing/2016/5/9/chartex" xmlns:cx4="http://schemas.microsoft.com/office/drawing/2016/5/10/chartex" xmlns:cx5="http://schemas.microsoft.com/office/drawing/2016/5/11/chartex" xmlns:cx6="http://schemas.microsoft.com/office/drawing/2016/5/12/chartex" xmlns:cx7="http://schemas.microsoft.com/office/drawing/2016/5/13/chartex" xmlns:cx8="http://schemas.microsoft.com/office/drawing/2016/5/14/chartex" xmlns:mc="http://schemas.openxmlformats.org/markup-compatibility/2006" xmlns:aink="http://schemas.microsoft.com/office/drawing/2016/ink" xmlns:am3d="http://schemas.microsoft.com/office/drawing/2017/model3d" xmlns:o="urn:schemas-microsoft-com:office:office" xmlns:oel="http://schemas.microsoft.com/office/2019/extlst" xmlns:r="http://schemas.openxmlformats.org/officeDocument/2006/relationships" xmlns:m="http://schemas.openxmlformats.org/officeDocument/2006/math" xmlns:v="urn:schemas-microsoft-com:vml" xmlns:wp14="http://schemas.microsoft.com/office/word/2010/wordprocessingDrawing" xmlns:wp="http://schemas.openxmlformats.org/drawingml/2006/wordprocessingDrawing" xmlns:w10="urn:schemas-microsoft-com:office:word" xmlns:w="http://schemas.openxmlformats.org/wordprocessingml/2006/main" xmlns:w14="http://schemas.microsoft.com/office/word/2010/wordml" xmlns:w15="http://schemas.microsoft.com/office/word/2012/wordml" xmlns:w16cex="http://schemas.microsoft.com/office/word/2018/wordml/cex" xmlns:w16cid="http://schemas.microsoft.com/office/word/2016/wordml/cid" xmlns:w16="http://schemas.microsoft.com/office/word/2018/wordml" xmlns:w16du="http://schemas.microsoft.com/office/word/2023/wordml/word16du" xmlns:w16sdtdh="http://schemas.microsoft.com/office/word/2020/wordml/sdtdatahash" xmlns:w16sdtfl="http://schemas.microsoft.com/office/word/2024/wordml/sdtformatlock" xmlns:w16se="http://schemas.microsoft.com/office/word/2015/wordml/symex" xmlns:wpg="http://schemas.microsoft.com/office/word/2010/wordprocessingGroup" xmlns:wpi="http://schemas.microsoft.com/office/word/2010/wordprocessingInk" xmlns:wne="http://schemas.microsoft.com/office/word/2006/wordml" xmlns:wps="http://schemas.microsoft.com/office/word/2010/wordprocessingShape" mc:Ignorable="w14 w15 w16se w16cid w16 w16cex w16sdtdh w16sdtfl w16du wp14">
   <w:body>
     <w:p/>
     <w:p/>
@@ -13,14 +13,14 @@
         <w:rPr>
           <w:sz w:val="48"/>
           <w:szCs w:val="48"/>
-          <w:lang w:val="de-DE"/>
+          <w:lang w:val="en-US"/>
         </w:rPr>
       </w:pPr>
       <w:r>
         <w:rPr>
           <w:sz w:val="48"/>
           <w:szCs w:val="48"/>
-          <w:lang w:val="de-DE"/>
+          <w:lang w:val="en-US"/>
         </w:rPr>
         <w:t xml:space="preserve">         </w:t>
       </w:r>
@@ -28,7 +28,7 @@
         <w:rPr>
           <w:sz w:val="48"/>
           <w:szCs w:val="48"/>
-          <w:lang w:val="de-DE"/>
+          <w:lang w:val="en-US"/>
         </w:rPr>
         <w:tab/>
       </w:r>
@@ -36,87 +36,173 @@
         <w:rPr>
           <w:sz w:val="48"/>
           <w:szCs w:val="48"/>
-          <w:lang w:val="de-DE"/>
+          <w:lang w:val="en-US"/>
         </w:rPr>
         <w:tab/>
-      </w:r>
-      <w:r>
+        <w:t>ORDERMANAGER</w:t>
+      </w:r>
+    </w:p>
+    <w:p>
+      <w:pPr>
         <w:rPr>
           <w:sz w:val="48"/>
           <w:szCs w:val="48"/>
-          <w:lang w:val="de-DE"/>
-        </w:rPr>
-        <w:t>ORDERMANAGER</w:t>
-      </w:r>
+          <w:lang w:val="en-US"/>
+        </w:rPr>
+      </w:pPr>
     </w:p>
     <w:p>
       <w:pPr>
+        <w:ind w:left="2160"/>
         <w:rPr>
           <w:sz w:val="48"/>
           <w:szCs w:val="48"/>
-          <w:lang w:val="de-DE"/>
-        </w:rPr>
-      </w:pPr>
+          <w:lang w:val="en-US"/>
+        </w:rPr>
+      </w:pPr>
+      <w:r>
+        <w:rPr>
+          <w:sz w:val="48"/>
+          <w:szCs w:val="48"/>
+          <w:lang w:val="en-US"/>
+        </w:rPr>
+        <w:t xml:space="preserve">  </w:t>
+      </w:r>
+      <w:r>
+        <w:rPr>
+          <w:sz w:val="48"/>
+          <w:szCs w:val="48"/>
+          <w:lang w:val="en-US"/>
+        </w:rPr>
+        <w:t xml:space="preserve">    </w:t>
+      </w:r>
+      <w:r>
+        <w:rPr>
+          <w:sz w:val="48"/>
+          <w:szCs w:val="48"/>
+          <w:lang w:val="en-US"/>
+        </w:rPr>
+        <w:t>User Manual</w:t>
+      </w:r>
     </w:p>
     <w:p>
       <w:pPr>
-        <w:ind w:left="2160"/>
         <w:rPr>
           <w:sz w:val="48"/>
           <w:szCs w:val="48"/>
           <w:lang w:val="en-US"/>
         </w:rPr>
       </w:pPr>
-      <w:r>
+    </w:p>
+    <w:p>
+      <w:pPr>
         <w:rPr>
           <w:sz w:val="48"/>
           <w:szCs w:val="48"/>
           <w:lang w:val="en-US"/>
         </w:rPr>
-        <w:t xml:space="preserve">  </w:t>
-      </w:r>
+      </w:pPr>
       <w:r>
         <w:rPr>
           <w:sz w:val="48"/>
           <w:szCs w:val="48"/>
           <w:lang w:val="en-US"/>
         </w:rPr>
-        <w:t xml:space="preserve">    </w:t>
-      </w:r>
-      <w:r>
-        <w:rPr>
-          <w:sz w:val="48"/>
-          <w:szCs w:val="48"/>
-          <w:lang w:val="en-US"/>
-        </w:rPr>
-        <w:t>User Manual</w:t>
+        <w:br w:type="page"/>
       </w:r>
     </w:p>
     <w:p>
       <w:pPr>
         <w:rPr>
-          <w:sz w:val="48"/>
-          <w:szCs w:val="48"/>
-          <w:lang w:val="en-US"/>
-        </w:rPr>
-      </w:pPr>
+          <w:sz w:val="28"/>
+          <w:szCs w:val="28"/>
+          <w:lang w:val="en-US"/>
+        </w:rPr>
+      </w:pPr>
+      <w:r>
+        <w:rPr>
+          <w:sz w:val="28"/>
+          <w:szCs w:val="28"/>
+          <w:lang w:val="en-US"/>
+        </w:rPr>
+        <w:lastRenderedPageBreak/>
+        <w:t>Build/Deploy/</w:t>
+      </w:r>
+      <w:r>
+        <w:rPr>
+          <w:sz w:val="28"/>
+          <w:szCs w:val="28"/>
+          <w:lang w:val="en-US"/>
+        </w:rPr>
+        <w:t>Start application in docker container.</w:t>
+      </w:r>
     </w:p>
     <w:p>
       <w:pPr>
         <w:rPr>
-          <w:sz w:val="48"/>
-          <w:szCs w:val="48"/>
-          <w:lang w:val="en-US"/>
-        </w:rPr>
-      </w:pPr>
-      <w:r>
-        <w:rPr>
-          <w:sz w:val="48"/>
-          <w:szCs w:val="48"/>
-          <w:lang w:val="en-US"/>
-        </w:rPr>
-        <w:br w:type="page"/>
-      </w:r>
+          <w:lang w:val="en-US"/>
+        </w:rPr>
+      </w:pPr>
+      <w:proofErr w:type="spellStart"/>
+      <w:r>
+        <w:rPr>
+          <w:lang w:val="en-US"/>
+        </w:rPr>
+        <w:t>Attantion</w:t>
+      </w:r>
+      <w:proofErr w:type="spellEnd"/>
+      <w:r>
+        <w:rPr>
+          <w:lang w:val="en-US"/>
+        </w:rPr>
+        <w:t xml:space="preserve">: If database is already installed, </w:t>
+      </w:r>
+      <w:proofErr w:type="gramStart"/>
+      <w:r>
+        <w:rPr>
+          <w:lang w:val="en-US"/>
+        </w:rPr>
+        <w:t>than</w:t>
+      </w:r>
+      <w:proofErr w:type="gramEnd"/>
+      <w:r>
+        <w:rPr>
+          <w:lang w:val="en-US"/>
+        </w:rPr>
+        <w:t xml:space="preserve"> in both </w:t>
+      </w:r>
+      <w:r>
+        <w:rPr>
+          <w:lang w:val="en-US"/>
+        </w:rPr>
+        <w:t xml:space="preserve">variants comments the database installation in docker/delete-start.bat </w:t>
+      </w:r>
+      <w:proofErr w:type="gramStart"/>
+      <w:r>
+        <w:rPr>
+          <w:lang w:val="en-US"/>
+        </w:rPr>
+        <w:t xml:space="preserve">or </w:t>
+      </w:r>
+      <w:r>
+        <w:rPr>
+          <w:lang w:val="en-US"/>
+        </w:rPr>
+        <w:t xml:space="preserve"> </w:t>
+      </w:r>
+      <w:r>
+        <w:rPr>
+          <w:lang w:val="en-US"/>
+        </w:rPr>
+        <w:t>docker/delete-start.</w:t>
+      </w:r>
+      <w:r>
+        <w:rPr>
+          <w:lang w:val="en-US"/>
+        </w:rPr>
+        <w:t>sh</w:t>
+      </w:r>
+      <w:proofErr w:type="gramEnd"/>
     </w:p>
     <w:p>
       <w:pPr>
@@ -132,9 +218,226 @@
           <w:szCs w:val="28"/>
           <w:lang w:val="en-US"/>
         </w:rPr>
-        <w:lastRenderedPageBreak/>
-        <w:t>Start application in docker container.</w:t>
-      </w:r>
+        <w:t>Variant 1</w:t>
+      </w:r>
+      <w:r>
+        <w:rPr>
+          <w:sz w:val="28"/>
+          <w:szCs w:val="28"/>
+          <w:lang w:val="en-US"/>
+        </w:rPr>
+        <w:t>: build project, docker images and deploy to docker manual</w:t>
+      </w:r>
+    </w:p>
+    <w:p>
+      <w:pPr>
+        <w:pStyle w:val="berschrift4"/>
+        <w:rPr>
+          <w:color w:val="auto"/>
+          <w:lang w:val="en-US"/>
+        </w:rPr>
+      </w:pPr>
+      <w:r>
+        <w:rPr>
+          <w:color w:val="auto"/>
+        </w:rPr>
+        <w:t>Step 1</w:t>
+      </w:r>
+      <w:r>
+        <w:rPr>
+          <w:color w:val="auto"/>
+          <w:lang w:val="en-US"/>
+        </w:rPr>
+        <w:t xml:space="preserve">: </w:t>
+      </w:r>
+      <w:r>
+        <w:rPr>
+          <w:color w:val="auto"/>
+          <w:lang w:val="en-US"/>
+        </w:rPr>
+        <w:t xml:space="preserve"> build project with maven </w:t>
+      </w:r>
+    </w:p>
+    <w:p>
+      <w:pPr>
+        <w:pStyle w:val="KeinLeerraum"/>
+        <w:rPr>
+          <w:lang w:val="en-US"/>
+        </w:rPr>
+      </w:pPr>
+    </w:p>
+    <w:p>
+      <w:pPr>
+        <w:pStyle w:val="KeinLeerraum"/>
+        <w:numPr>
+          <w:ilvl w:val="0"/>
+          <w:numId w:val="4"/>
+        </w:numPr>
+        <w:rPr>
+          <w:lang w:val="en-US"/>
+        </w:rPr>
+      </w:pPr>
+      <w:r>
+        <w:rPr>
+          <w:lang w:val="en-US"/>
+        </w:rPr>
+        <w:t xml:space="preserve">Go to the parent project </w:t>
+      </w:r>
+      <w:proofErr w:type="spellStart"/>
+      <w:proofErr w:type="gramStart"/>
+      <w:r>
+        <w:rPr>
+          <w:lang w:val="en-US"/>
+        </w:rPr>
+        <w:t>ordermanager</w:t>
+      </w:r>
+      <w:proofErr w:type="gramEnd"/>
+      <w:r>
+        <w:rPr>
+          <w:lang w:val="en-US"/>
+        </w:rPr>
+        <w:t>-paren</w:t>
+      </w:r>
+      <w:proofErr w:type="spellEnd"/>
+    </w:p>
+    <w:p>
+      <w:pPr>
+        <w:pStyle w:val="KeinLeerraum"/>
+        <w:numPr>
+          <w:ilvl w:val="0"/>
+          <w:numId w:val="4"/>
+        </w:numPr>
+        <w:rPr>
+          <w:lang w:val="en-US"/>
+        </w:rPr>
+      </w:pPr>
+      <w:r>
+        <w:rPr>
+          <w:lang w:val="en-US"/>
+        </w:rPr>
+        <w:t>Run command</w:t>
+      </w:r>
+      <w:proofErr w:type="gramStart"/>
+      <w:r>
+        <w:rPr>
+          <w:lang w:val="en-US"/>
+        </w:rPr>
+        <w:t xml:space="preserve">:  </w:t>
+      </w:r>
+      <w:proofErr w:type="spellStart"/>
+      <w:r>
+        <w:rPr>
+          <w:i/>
+          <w:iCs w:val="0"/>
+          <w:lang w:val="en-US"/>
+        </w:rPr>
+        <w:t>mvn</w:t>
+      </w:r>
+      <w:proofErr w:type="spellEnd"/>
+      <w:proofErr w:type="gramEnd"/>
+      <w:r>
+        <w:rPr>
+          <w:i/>
+          <w:iCs w:val="0"/>
+          <w:lang w:val="en-US"/>
+        </w:rPr>
+        <w:t xml:space="preserve"> clean </w:t>
+      </w:r>
+      <w:proofErr w:type="gramStart"/>
+      <w:r>
+        <w:rPr>
+          <w:i/>
+          <w:iCs w:val="0"/>
+          <w:lang w:val="en-US"/>
+        </w:rPr>
+        <w:t>install</w:t>
+      </w:r>
+      <w:r>
+        <w:rPr>
+          <w:lang w:val="en-US"/>
+        </w:rPr>
+        <w:t xml:space="preserve"> </w:t>
+      </w:r>
+      <w:r>
+        <w:rPr>
+          <w:lang w:val="en-US"/>
+        </w:rPr>
+        <w:t xml:space="preserve"> -</w:t>
+      </w:r>
+      <w:proofErr w:type="spellStart"/>
+      <w:proofErr w:type="gramEnd"/>
+      <w:r>
+        <w:rPr>
+          <w:lang w:val="en-US"/>
+        </w:rPr>
+        <w:t>Pbuild</w:t>
+      </w:r>
+      <w:proofErr w:type="spellEnd"/>
+      <w:r>
+        <w:rPr>
+          <w:lang w:val="en-US"/>
+        </w:rPr>
+        <w:t>-angular</w:t>
+      </w:r>
+    </w:p>
+    <w:p>
+      <w:pPr>
+        <w:pStyle w:val="KeinLeerraum"/>
+        <w:rPr>
+          <w:lang w:val="en-US"/>
+        </w:rPr>
+      </w:pPr>
+    </w:p>
+    <w:p>
+      <w:pPr>
+        <w:pStyle w:val="berschrift4"/>
+        <w:rPr>
+          <w:color w:val="auto"/>
+          <w:lang w:val="en-US"/>
+        </w:rPr>
+      </w:pPr>
+      <w:r>
+        <w:rPr>
+          <w:color w:val="auto"/>
+        </w:rPr>
+        <w:t xml:space="preserve">Step </w:t>
+      </w:r>
+      <w:r>
+        <w:rPr>
+          <w:color w:val="auto"/>
+          <w:lang w:val="en-US"/>
+        </w:rPr>
+        <w:t>2</w:t>
+      </w:r>
+      <w:r>
+        <w:rPr>
+          <w:color w:val="auto"/>
+          <w:lang w:val="en-US"/>
+        </w:rPr>
+        <w:t xml:space="preserve">: </w:t>
+      </w:r>
+      <w:r>
+        <w:rPr>
+          <w:color w:val="auto"/>
+          <w:lang w:val="en-US"/>
+        </w:rPr>
+        <w:t xml:space="preserve"> build </w:t>
+      </w:r>
+      <w:r>
+        <w:rPr>
+          <w:color w:val="auto"/>
+          <w:lang w:val="en-US"/>
+        </w:rPr>
+        <w:t>docker images and deploy to docker</w:t>
+      </w:r>
+    </w:p>
+    <w:p>
+      <w:pPr>
+        <w:pStyle w:val="KeinLeerraum"/>
+        <w:rPr>
+          <w:lang w:val="en-US"/>
+        </w:rPr>
+      </w:pPr>
     </w:p>
     <w:p>
       <w:pPr>
@@ -247,7 +550,7 @@
     </w:p>
     <w:p>
       <w:pPr>
-        <w:pStyle w:val="ListParagraph"/>
+        <w:pStyle w:val="Listenabsatz"/>
         <w:numPr>
           <w:ilvl w:val="0"/>
           <w:numId w:val="3"/>
@@ -267,7 +570,7 @@
     </w:p>
     <w:p>
       <w:pPr>
-        <w:pStyle w:val="ListParagraph"/>
+        <w:pStyle w:val="Listenabsatz"/>
         <w:numPr>
           <w:ilvl w:val="0"/>
           <w:numId w:val="3"/>
@@ -302,7 +605,7 @@
     </w:p>
     <w:p>
       <w:pPr>
-        <w:pStyle w:val="ListParagraph"/>
+        <w:pStyle w:val="Listenabsatz"/>
         <w:numPr>
           <w:ilvl w:val="0"/>
           <w:numId w:val="3"/>
@@ -334,6 +637,274 @@
         </w:rPr>
         <w:t xml:space="preserve"> run docker-compose (see ./docker/README_DOCKER.md)</w:t>
       </w:r>
+    </w:p>
+    <w:p>
+      <w:pPr>
+        <w:rPr>
+          <w:sz w:val="20"/>
+          <w:szCs w:val="20"/>
+          <w:lang w:val="de-DE"/>
+        </w:rPr>
+      </w:pPr>
+    </w:p>
+    <w:p>
+      <w:pPr>
+        <w:rPr>
+          <w:sz w:val="28"/>
+          <w:szCs w:val="28"/>
+          <w:lang w:val="en-US"/>
+        </w:rPr>
+      </w:pPr>
+      <w:r>
+        <w:rPr>
+          <w:sz w:val="28"/>
+          <w:szCs w:val="28"/>
+          <w:lang w:val="en-US"/>
+        </w:rPr>
+        <w:t xml:space="preserve">Variant </w:t>
+      </w:r>
+      <w:r>
+        <w:rPr>
+          <w:sz w:val="28"/>
+          <w:szCs w:val="28"/>
+          <w:lang w:val="en-US"/>
+        </w:rPr>
+        <w:t>2</w:t>
+      </w:r>
+      <w:r>
+        <w:rPr>
+          <w:sz w:val="28"/>
+          <w:szCs w:val="28"/>
+          <w:lang w:val="en-US"/>
+        </w:rPr>
+        <w:t>: build project, docker images and deploy them automatically</w:t>
+      </w:r>
+    </w:p>
+    <w:p>
+      <w:pPr>
+        <w:pStyle w:val="KeinLeerraum"/>
+        <w:rPr>
+          <w:lang w:val="en-US"/>
+        </w:rPr>
+      </w:pPr>
+      <w:r>
+        <w:rPr>
+          <w:lang w:val="en-US"/>
+        </w:rPr>
+        <w:t xml:space="preserve">To build and </w:t>
+      </w:r>
+      <w:r>
+        <w:rPr>
+          <w:lang w:val="en-US"/>
+        </w:rPr>
+        <w:t xml:space="preserve">deploy all automatically please use maven profiles </w:t>
+      </w:r>
+    </w:p>
+    <w:p>
+      <w:pPr>
+        <w:pStyle w:val="KeinLeerraum"/>
+        <w:numPr>
+          <w:ilvl w:val="0"/>
+          <w:numId w:val="3"/>
+        </w:numPr>
+        <w:rPr>
+          <w:lang w:val="en-US"/>
+        </w:rPr>
+      </w:pPr>
+      <w:r>
+        <w:rPr>
+          <w:i/>
+          <w:iCs w:val="0"/>
+          <w:lang w:val="en-US"/>
+        </w:rPr>
+        <w:t>with-docker-</w:t>
+      </w:r>
+      <w:proofErr w:type="spellStart"/>
+      <w:r>
+        <w:rPr>
+          <w:i/>
+          <w:iCs w:val="0"/>
+          <w:lang w:val="en-US"/>
+        </w:rPr>
+        <w:t>linux</w:t>
+      </w:r>
+      <w:proofErr w:type="spellEnd"/>
+      <w:r>
+        <w:rPr>
+          <w:lang w:val="en-US"/>
+        </w:rPr>
+        <w:t xml:space="preserve"> for </w:t>
+      </w:r>
+      <w:proofErr w:type="spellStart"/>
+      <w:r>
+        <w:rPr>
+          <w:lang w:val="en-US"/>
+        </w:rPr>
+        <w:t>linux</w:t>
+      </w:r>
+      <w:proofErr w:type="spellEnd"/>
+      <w:r>
+        <w:rPr>
+          <w:lang w:val="en-US"/>
+        </w:rPr>
+        <w:t>/Unix</w:t>
+      </w:r>
+    </w:p>
+    <w:p>
+      <w:pPr>
+        <w:pStyle w:val="KeinLeerraum"/>
+        <w:numPr>
+          <w:ilvl w:val="0"/>
+          <w:numId w:val="3"/>
+        </w:numPr>
+        <w:rPr>
+          <w:lang w:val="en-US"/>
+        </w:rPr>
+      </w:pPr>
+      <w:r>
+        <w:rPr>
+          <w:i/>
+          <w:iCs w:val="0"/>
+          <w:lang w:val="en-US"/>
+        </w:rPr>
+        <w:t>with-docker-</w:t>
+      </w:r>
+      <w:r>
+        <w:rPr>
+          <w:i/>
+          <w:iCs w:val="0"/>
+          <w:lang w:val="en-US"/>
+        </w:rPr>
+        <w:t>windows</w:t>
+      </w:r>
+      <w:r>
+        <w:rPr>
+          <w:lang w:val="en-US"/>
+        </w:rPr>
+        <w:t xml:space="preserve"> for </w:t>
+      </w:r>
+      <w:r>
+        <w:rPr>
+          <w:lang w:val="en-US"/>
+        </w:rPr>
+        <w:t>MS Windows</w:t>
+      </w:r>
+    </w:p>
+    <w:p>
+      <w:pPr>
+        <w:pStyle w:val="KeinLeerraum"/>
+        <w:ind w:left="400"/>
+        <w:rPr>
+          <w:lang w:val="en-US"/>
+        </w:rPr>
+      </w:pPr>
+    </w:p>
+    <w:p>
+      <w:pPr>
+        <w:pStyle w:val="KeinLeerraum"/>
+        <w:ind w:left="400"/>
+        <w:rPr>
+          <w:lang w:val="en-US"/>
+        </w:rPr>
+      </w:pPr>
+      <w:r>
+        <w:rPr>
+          <w:lang w:val="en-US"/>
+        </w:rPr>
+        <w:t xml:space="preserve">From command line: </w:t>
+      </w:r>
+      <w:proofErr w:type="spellStart"/>
+      <w:r>
+        <w:rPr>
+          <w:i/>
+          <w:iCs w:val="0"/>
+          <w:lang w:val="en-US"/>
+        </w:rPr>
+        <w:t>mvn</w:t>
+      </w:r>
+      <w:proofErr w:type="spellEnd"/>
+      <w:r>
+        <w:rPr>
+          <w:i/>
+          <w:iCs w:val="0"/>
+          <w:lang w:val="en-US"/>
+        </w:rPr>
+        <w:t xml:space="preserve"> clean install -</w:t>
+      </w:r>
+      <w:proofErr w:type="spellStart"/>
+      <w:r>
+        <w:rPr>
+          <w:i/>
+          <w:iCs w:val="0"/>
+          <w:lang w:val="en-US"/>
+        </w:rPr>
+        <w:t>Pwith</w:t>
+      </w:r>
+      <w:proofErr w:type="spellEnd"/>
+      <w:r>
+        <w:rPr>
+          <w:i/>
+          <w:iCs w:val="0"/>
+          <w:lang w:val="en-US"/>
+        </w:rPr>
+        <w:t>-docker-</w:t>
+      </w:r>
+      <w:proofErr w:type="spellStart"/>
+      <w:r>
+        <w:rPr>
+          <w:i/>
+          <w:iCs w:val="0"/>
+          <w:lang w:val="en-US"/>
+        </w:rPr>
+        <w:t>linux</w:t>
+      </w:r>
+      <w:proofErr w:type="spellEnd"/>
+      <w:r>
+        <w:rPr>
+          <w:i/>
+          <w:iCs w:val="0"/>
+          <w:lang w:val="en-US"/>
+        </w:rPr>
+        <w:t xml:space="preserve"> </w:t>
+      </w:r>
+      <w:r>
+        <w:rPr>
+          <w:lang w:val="en-US"/>
+        </w:rPr>
+        <w:t>-</w:t>
+      </w:r>
+      <w:proofErr w:type="spellStart"/>
+      <w:r>
+        <w:rPr>
+          <w:lang w:val="en-US"/>
+        </w:rPr>
+        <w:t>Pbuild</w:t>
+      </w:r>
+      <w:proofErr w:type="spellEnd"/>
+      <w:r>
+        <w:rPr>
+          <w:lang w:val="en-US"/>
+        </w:rPr>
+        <w:t>-angular</w:t>
+      </w:r>
+    </w:p>
+    <w:p>
+      <w:pPr>
+        <w:pStyle w:val="KeinLeerraum"/>
+        <w:ind w:left="400"/>
+        <w:rPr>
+          <w:lang w:val="en-US"/>
+        </w:rPr>
+      </w:pPr>
+    </w:p>
+    <w:p>
+      <w:pPr>
+        <w:pStyle w:val="KeinLeerraum"/>
+        <w:ind w:left="400"/>
+        <w:rPr>
+          <w:lang w:val="en-US"/>
+        </w:rPr>
+      </w:pPr>
     </w:p>
     <w:sectPr>
       <w:pgSz w:w="11906" w:h="16838"/>
@@ -346,7 +917,7 @@
 </file>
 
 <file path=word/numbering.xml><?xml version="1.0" encoding="utf-8"?>
-<w:numbering xmlns:wpc="http://schemas.microsoft.com/office/word/2010/wordprocessingCanvas" xmlns:cx="http://schemas.microsoft.com/office/drawing/2014/chartex" xmlns:cx1="http://schemas.microsoft.com/office/drawing/2015/9/8/chartex" xmlns:cx2="http://schemas.microsoft.com/office/drawing/2015/10/21/chartex" xmlns:cx3="http://schemas.microsoft.com/office/drawing/2016/5/9/chartex" xmlns:cx4="http://schemas.microsoft.com/office/drawing/2016/5/10/chartex" xmlns:cx5="http://schemas.microsoft.com/office/drawing/2016/5/11/chartex" xmlns:cx6="http://schemas.microsoft.com/office/drawing/2016/5/12/chartex" xmlns:cx7="http://schemas.microsoft.com/office/drawing/2016/5/13/chartex" xmlns:cx8="http://schemas.microsoft.com/office/drawing/2016/5/14/chartex" xmlns:mc="http://schemas.openxmlformats.org/markup-compatibility/2006" xmlns:aink="http://schemas.microsoft.com/office/drawing/2016/ink" xmlns:am3d="http://schemas.microsoft.com/office/drawing/2017/model3d" xmlns:o="urn:schemas-microsoft-com:office:office" xmlns:oel="http://schemas.microsoft.com/office/2019/extlst" xmlns:r="http://schemas.openxmlformats.org/officeDocument/2006/relationships" xmlns:m="http://schemas.openxmlformats.org/officeDocument/2006/math" xmlns:v="urn:schemas-microsoft-com:vml" xmlns:wp14="http://schemas.microsoft.com/office/word/2010/wordprocessingDrawing" xmlns:wp="http://schemas.openxmlformats.org/drawingml/2006/wordprocessingDrawing" xmlns:w10="urn:schemas-microsoft-com:office:word" xmlns:w="http://schemas.openxmlformats.org/wordprocessingml/2006/main" xmlns:w14="http://schemas.microsoft.com/office/word/2010/wordml" xmlns:w15="http://schemas.microsoft.com/office/word/2012/wordml" xmlns:w16cex="http://schemas.microsoft.com/office/word/2018/wordml/cex" xmlns:w16cid="http://schemas.microsoft.com/office/word/2016/wordml/cid" xmlns:w16="http://schemas.microsoft.com/office/word/2018/wordml" xmlns:w16sdtdh="http://schemas.microsoft.com/office/word/2020/wordml/sdtdatahash" xmlns:w16se="http://schemas.microsoft.com/office/word/2015/wordml/symex" xmlns:wpg="http://schemas.microsoft.com/office/word/2010/wordprocessingGroup" xmlns:wpi="http://schemas.microsoft.com/office/word/2010/wordprocessingInk" xmlns:wne="http://schemas.microsoft.com/office/word/2006/wordml" xmlns:wps="http://schemas.microsoft.com/office/word/2010/wordprocessingShape" mc:Ignorable="w14 w15 w16se w16cid w16 w16cex w16sdtdh wp14">
+<w:numbering xmlns:wpc="http://schemas.microsoft.com/office/word/2010/wordprocessingCanvas" xmlns:cx="http://schemas.microsoft.com/office/drawing/2014/chartex" xmlns:cx1="http://schemas.microsoft.com/office/drawing/2015/9/8/chartex" xmlns:cx2="http://schemas.microsoft.com/office/drawing/2015/10/21/chartex" xmlns:cx3="http://schemas.microsoft.com/office/drawing/2016/5/9/chartex" xmlns:cx4="http://schemas.microsoft.com/office/drawing/2016/5/10/chartex" xmlns:cx5="http://schemas.microsoft.com/office/drawing/2016/5/11/chartex" xmlns:cx6="http://schemas.microsoft.com/office/drawing/2016/5/12/chartex" xmlns:cx7="http://schemas.microsoft.com/office/drawing/2016/5/13/chartex" xmlns:cx8="http://schemas.microsoft.com/office/drawing/2016/5/14/chartex" xmlns:mc="http://schemas.openxmlformats.org/markup-compatibility/2006" xmlns:aink="http://schemas.microsoft.com/office/drawing/2016/ink" xmlns:am3d="http://schemas.microsoft.com/office/drawing/2017/model3d" xmlns:o="urn:schemas-microsoft-com:office:office" xmlns:oel="http://schemas.microsoft.com/office/2019/extlst" xmlns:r="http://schemas.openxmlformats.org/officeDocument/2006/relationships" xmlns:m="http://schemas.openxmlformats.org/officeDocument/2006/math" xmlns:v="urn:schemas-microsoft-com:vml" xmlns:wp14="http://schemas.microsoft.com/office/word/2010/wordprocessingDrawing" xmlns:wp="http://schemas.openxmlformats.org/drawingml/2006/wordprocessingDrawing" xmlns:w10="urn:schemas-microsoft-com:office:word" xmlns:w="http://schemas.openxmlformats.org/wordprocessingml/2006/main" xmlns:w14="http://schemas.microsoft.com/office/word/2010/wordml" xmlns:w15="http://schemas.microsoft.com/office/word/2012/wordml" xmlns:w16cex="http://schemas.microsoft.com/office/word/2018/wordml/cex" xmlns:w16cid="http://schemas.microsoft.com/office/word/2016/wordml/cid" xmlns:w16="http://schemas.microsoft.com/office/word/2018/wordml" xmlns:w16du="http://schemas.microsoft.com/office/word/2023/wordml/word16du" xmlns:w16sdtdh="http://schemas.microsoft.com/office/word/2020/wordml/sdtdatahash" xmlns:w16sdtfl="http://schemas.microsoft.com/office/word/2024/wordml/sdtformatlock" xmlns:w16se="http://schemas.microsoft.com/office/word/2015/wordml/symex" xmlns:wpg="http://schemas.microsoft.com/office/word/2010/wordprocessingGroup" xmlns:wpi="http://schemas.microsoft.com/office/word/2010/wordprocessingInk" xmlns:wne="http://schemas.microsoft.com/office/word/2006/wordml" xmlns:wps="http://schemas.microsoft.com/office/word/2010/wordprocessingShape" mc:Ignorable="w14 w15 w16se w16cid w16 w16cex w16sdtdh w16sdtfl w16du wp14">
   <w:abstractNum w:abstractNumId="0" w15:restartNumberingAfterBreak="0">
     <w:nsid w:val="23DB4463"/>
     <w:multiLevelType w:val="hybridMultilevel"/>
@@ -460,6 +1031,118 @@
     </w:lvl>
   </w:abstractNum>
   <w:abstractNum w:abstractNumId="1" w15:restartNumberingAfterBreak="0">
+    <w:nsid w:val="653160DA"/>
+    <w:multiLevelType w:val="hybridMultilevel"/>
+    <w:tmpl w:val="4CC82A3E"/>
+    <w:lvl w:ilvl="0" w:tplc="FEC2EDDA">
+      <w:numFmt w:val="bullet"/>
+      <w:lvlText w:val="-"/>
+      <w:lvlJc w:val="left"/>
+      <w:pPr>
+        <w:ind w:left="405" w:hanging="360"/>
+      </w:pPr>
+      <w:rPr>
+        <w:rFonts w:ascii="Calibri" w:eastAsiaTheme="minorEastAsia" w:hAnsi="Calibri" w:cs="Calibri" w:hint="default"/>
+      </w:rPr>
+    </w:lvl>
+    <w:lvl w:ilvl="1" w:tplc="04070003" w:tentative="1">
+      <w:start w:val="1"/>
+      <w:numFmt w:val="bullet"/>
+      <w:lvlText w:val="o"/>
+      <w:lvlJc w:val="left"/>
+      <w:pPr>
+        <w:ind w:left="1125" w:hanging="360"/>
+      </w:pPr>
+      <w:rPr>
+        <w:rFonts w:ascii="Courier New" w:hAnsi="Courier New" w:cs="Courier New" w:hint="default"/>
+      </w:rPr>
+    </w:lvl>
+    <w:lvl w:ilvl="2" w:tplc="04070005" w:tentative="1">
+      <w:start w:val="1"/>
+      <w:numFmt w:val="bullet"/>
+      <w:lvlText w:val=""/>
+      <w:lvlJc w:val="left"/>
+      <w:pPr>
+        <w:ind w:left="1845" w:hanging="360"/>
+      </w:pPr>
+      <w:rPr>
+        <w:rFonts w:ascii="Wingdings" w:hAnsi="Wingdings" w:hint="default"/>
+      </w:rPr>
+    </w:lvl>
+    <w:lvl w:ilvl="3" w:tplc="04070001" w:tentative="1">
+      <w:start w:val="1"/>
+      <w:numFmt w:val="bullet"/>
+      <w:lvlText w:val=""/>
+      <w:lvlJc w:val="left"/>
+      <w:pPr>
+        <w:ind w:left="2565" w:hanging="360"/>
+      </w:pPr>
+      <w:rPr>
+        <w:rFonts w:ascii="Symbol" w:hAnsi="Symbol" w:hint="default"/>
+      </w:rPr>
+    </w:lvl>
+    <w:lvl w:ilvl="4" w:tplc="04070003" w:tentative="1">
+      <w:start w:val="1"/>
+      <w:numFmt w:val="bullet"/>
+      <w:lvlText w:val="o"/>
+      <w:lvlJc w:val="left"/>
+      <w:pPr>
+        <w:ind w:left="3285" w:hanging="360"/>
+      </w:pPr>
+      <w:rPr>
+        <w:rFonts w:ascii="Courier New" w:hAnsi="Courier New" w:cs="Courier New" w:hint="default"/>
+      </w:rPr>
+    </w:lvl>
+    <w:lvl w:ilvl="5" w:tplc="04070005" w:tentative="1">
+      <w:start w:val="1"/>
+      <w:numFmt w:val="bullet"/>
+      <w:lvlText w:val=""/>
+      <w:lvlJc w:val="left"/>
+      <w:pPr>
+        <w:ind w:left="4005" w:hanging="360"/>
+      </w:pPr>
+      <w:rPr>
+        <w:rFonts w:ascii="Wingdings" w:hAnsi="Wingdings" w:hint="default"/>
+      </w:rPr>
+    </w:lvl>
+    <w:lvl w:ilvl="6" w:tplc="04070001" w:tentative="1">
+      <w:start w:val="1"/>
+      <w:numFmt w:val="bullet"/>
+      <w:lvlText w:val=""/>
+      <w:lvlJc w:val="left"/>
+      <w:pPr>
+        <w:ind w:left="4725" w:hanging="360"/>
+      </w:pPr>
+      <w:rPr>
+        <w:rFonts w:ascii="Symbol" w:hAnsi="Symbol" w:hint="default"/>
+      </w:rPr>
+    </w:lvl>
+    <w:lvl w:ilvl="7" w:tplc="04070003" w:tentative="1">
+      <w:start w:val="1"/>
+      <w:numFmt w:val="bullet"/>
+      <w:lvlText w:val="o"/>
+      <w:lvlJc w:val="left"/>
+      <w:pPr>
+        <w:ind w:left="5445" w:hanging="360"/>
+      </w:pPr>
+      <w:rPr>
+        <w:rFonts w:ascii="Courier New" w:hAnsi="Courier New" w:cs="Courier New" w:hint="default"/>
+      </w:rPr>
+    </w:lvl>
+    <w:lvl w:ilvl="8" w:tplc="04070005" w:tentative="1">
+      <w:start w:val="1"/>
+      <w:numFmt w:val="bullet"/>
+      <w:lvlText w:val=""/>
+      <w:lvlJc w:val="left"/>
+      <w:pPr>
+        <w:ind w:left="6165" w:hanging="360"/>
+      </w:pPr>
+      <w:rPr>
+        <w:rFonts w:ascii="Wingdings" w:hAnsi="Wingdings" w:hint="default"/>
+      </w:rPr>
+    </w:lvl>
+  </w:abstractNum>
+  <w:abstractNum w:abstractNumId="2" w15:restartNumberingAfterBreak="0">
     <w:nsid w:val="66651032"/>
     <w:multiLevelType w:val="hybridMultilevel"/>
     <w:tmpl w:val="24FC1A38"/>
@@ -572,14 +1255,14 @@
       </w:rPr>
     </w:lvl>
   </w:abstractNum>
-  <w:abstractNum w:abstractNumId="2" w15:restartNumberingAfterBreak="0">
+  <w:abstractNum w:abstractNumId="3" w15:restartNumberingAfterBreak="0">
     <w:nsid w:val="79911088"/>
     <w:multiLevelType w:val="hybridMultilevel"/>
     <w:tmpl w:val="B89254AA"/>
     <w:lvl w:ilvl="0" w:tplc="5ED0EE42">
       <w:start w:val="1"/>
       <w:numFmt w:val="bullet"/>
-      <w:pStyle w:val="ListParagraph"/>
+      <w:pStyle w:val="Listenabsatz"/>
       <w:lvlText w:val=""/>
       <w:lvlJc w:val="left"/>
       <w:pPr>
@@ -687,26 +1370,29 @@
     </w:lvl>
   </w:abstractNum>
   <w:num w:numId="1" w16cid:durableId="63769806">
-    <w:abstractNumId w:val="2"/>
+    <w:abstractNumId w:val="3"/>
   </w:num>
   <w:num w:numId="2" w16cid:durableId="1490251532">
-    <w:abstractNumId w:val="1"/>
+    <w:abstractNumId w:val="2"/>
   </w:num>
   <w:num w:numId="3" w16cid:durableId="30541539">
     <w:abstractNumId w:val="0"/>
+  </w:num>
+  <w:num w:numId="4" w16cid:durableId="1419015175">
+    <w:abstractNumId w:val="1"/>
   </w:num>
 </w:numbering>
 </file>
 
 <file path=word/styles.xml><?xml version="1.0" encoding="utf-8"?>
-<w:styles xmlns:mc="http://schemas.openxmlformats.org/markup-compatibility/2006" xmlns:r="http://schemas.openxmlformats.org/officeDocument/2006/relationships" xmlns:w="http://schemas.openxmlformats.org/wordprocessingml/2006/main" xmlns:w14="http://schemas.microsoft.com/office/word/2010/wordml" xmlns:w15="http://schemas.microsoft.com/office/word/2012/wordml" xmlns:w16cex="http://schemas.microsoft.com/office/word/2018/wordml/cex" xmlns:w16cid="http://schemas.microsoft.com/office/word/2016/wordml/cid" xmlns:w16="http://schemas.microsoft.com/office/word/2018/wordml" xmlns:w16sdtdh="http://schemas.microsoft.com/office/word/2020/wordml/sdtdatahash" xmlns:w16se="http://schemas.microsoft.com/office/word/2015/wordml/symex" mc:Ignorable="w14 w15 w16se w16cid w16 w16cex w16sdtdh">
+<w:styles xmlns:mc="http://schemas.openxmlformats.org/markup-compatibility/2006" xmlns:r="http://schemas.openxmlformats.org/officeDocument/2006/relationships" xmlns:w="http://schemas.openxmlformats.org/wordprocessingml/2006/main" xmlns:w14="http://schemas.microsoft.com/office/word/2010/wordml" xmlns:w15="http://schemas.microsoft.com/office/word/2012/wordml" xmlns:w16cex="http://schemas.microsoft.com/office/word/2018/wordml/cex" xmlns:w16cid="http://schemas.microsoft.com/office/word/2016/wordml/cid" xmlns:w16="http://schemas.microsoft.com/office/word/2018/wordml" xmlns:w16du="http://schemas.microsoft.com/office/word/2023/wordml/word16du" xmlns:w16sdtdh="http://schemas.microsoft.com/office/word/2020/wordml/sdtdatahash" xmlns:w16sdtfl="http://schemas.microsoft.com/office/word/2024/wordml/sdtformatlock" xmlns:w16se="http://schemas.microsoft.com/office/word/2015/wordml/symex" mc:Ignorable="w14 w15 w16se w16cid w16 w16cex w16sdtdh w16sdtfl w16du">
   <w:docDefaults>
     <w:rPrDefault>
       <w:rPr>
         <w:rFonts w:asciiTheme="minorHAnsi" w:eastAsiaTheme="minorEastAsia" w:hAnsiTheme="minorHAnsi" w:cstheme="minorBidi"/>
         <w:sz w:val="22"/>
         <w:szCs w:val="22"/>
-        <w:lang w:val="en-DE" w:eastAsia="en-US" w:bidi="ar-SA"/>
+        <w:lang w:eastAsia="en-US" w:bidi="ar-SA"/>
       </w:rPr>
     </w:rPrDefault>
     <w:pPrDefault>
@@ -1093,21 +1779,21 @@
     <w:lsdException w:name="Unresolved Mention" w:semiHidden="1" w:unhideWhenUsed="1"/>
     <w:lsdException w:name="Smart Link" w:semiHidden="1" w:unhideWhenUsed="1"/>
   </w:latentStyles>
-  <w:style w:type="paragraph" w:default="1" w:styleId="Normal">
+  <w:style w:type="paragraph" w:default="1" w:styleId="Standard">
     <w:name w:val="Normal"/>
     <w:qFormat/>
-    <w:rsid w:val="00046BEF"/>
+    <w:rsid w:val="00D55B8C"/>
     <w:rPr>
       <w:iCs/>
       <w:sz w:val="21"/>
       <w:szCs w:val="21"/>
     </w:rPr>
   </w:style>
-  <w:style w:type="paragraph" w:styleId="Heading1">
+  <w:style w:type="paragraph" w:styleId="berschrift1">
     <w:name w:val="heading 1"/>
-    <w:basedOn w:val="Normal"/>
-    <w:next w:val="Normal"/>
-    <w:link w:val="Heading1Char"/>
+    <w:basedOn w:val="Standard"/>
+    <w:next w:val="Standard"/>
+    <w:link w:val="berschrift1Zchn"/>
     <w:uiPriority w:val="9"/>
     <w:qFormat/>
     <w:rsid w:val="00046BEF"/>
@@ -1129,13 +1815,12 @@
       <w:szCs w:val="38"/>
     </w:rPr>
   </w:style>
-  <w:style w:type="paragraph" w:styleId="Heading2">
+  <w:style w:type="paragraph" w:styleId="berschrift2">
     <w:name w:val="heading 2"/>
-    <w:basedOn w:val="Normal"/>
-    <w:next w:val="Normal"/>
-    <w:link w:val="Heading2Char"/>
+    <w:basedOn w:val="Standard"/>
+    <w:next w:val="Standard"/>
+    <w:link w:val="berschrift2Zchn"/>
     <w:uiPriority w:val="9"/>
-    <w:semiHidden/>
     <w:unhideWhenUsed/>
     <w:qFormat/>
     <w:rsid w:val="00046BEF"/>
@@ -1166,13 +1851,12 @@
       </w14:textFill>
     </w:rPr>
   </w:style>
-  <w:style w:type="paragraph" w:styleId="Heading3">
+  <w:style w:type="paragraph" w:styleId="berschrift3">
     <w:name w:val="heading 3"/>
-    <w:basedOn w:val="Normal"/>
-    <w:next w:val="Normal"/>
-    <w:link w:val="Heading3Char"/>
+    <w:basedOn w:val="Standard"/>
+    <w:next w:val="Standard"/>
+    <w:link w:val="berschrift3Zchn"/>
     <w:uiPriority w:val="9"/>
-    <w:semiHidden/>
     <w:unhideWhenUsed/>
     <w:qFormat/>
     <w:rsid w:val="00046BEF"/>
@@ -1192,13 +1876,12 @@
       <w:szCs w:val="22"/>
     </w:rPr>
   </w:style>
-  <w:style w:type="paragraph" w:styleId="Heading4">
+  <w:style w:type="paragraph" w:styleId="berschrift4">
     <w:name w:val="heading 4"/>
-    <w:basedOn w:val="Normal"/>
-    <w:next w:val="Normal"/>
-    <w:link w:val="Heading4Char"/>
+    <w:basedOn w:val="Standard"/>
+    <w:next w:val="Standard"/>
+    <w:link w:val="berschrift4Zchn"/>
     <w:uiPriority w:val="9"/>
-    <w:semiHidden/>
     <w:unhideWhenUsed/>
     <w:qFormat/>
     <w:rsid w:val="00046BEF"/>
@@ -1216,11 +1899,11 @@
       <w:szCs w:val="22"/>
     </w:rPr>
   </w:style>
-  <w:style w:type="paragraph" w:styleId="Heading5">
+  <w:style w:type="paragraph" w:styleId="berschrift5">
     <w:name w:val="heading 5"/>
-    <w:basedOn w:val="Normal"/>
-    <w:next w:val="Normal"/>
-    <w:link w:val="Heading5Char"/>
+    <w:basedOn w:val="Standard"/>
+    <w:next w:val="Standard"/>
+    <w:link w:val="berschrift5Zchn"/>
     <w:uiPriority w:val="9"/>
     <w:semiHidden/>
     <w:unhideWhenUsed/>
@@ -1240,11 +1923,11 @@
       <w:szCs w:val="22"/>
     </w:rPr>
   </w:style>
-  <w:style w:type="paragraph" w:styleId="Heading6">
+  <w:style w:type="paragraph" w:styleId="berschrift6">
     <w:name w:val="heading 6"/>
-    <w:basedOn w:val="Normal"/>
-    <w:next w:val="Normal"/>
-    <w:link w:val="Heading6Char"/>
+    <w:basedOn w:val="Standard"/>
+    <w:next w:val="Standard"/>
+    <w:link w:val="berschrift6Zchn"/>
     <w:uiPriority w:val="9"/>
     <w:semiHidden/>
     <w:unhideWhenUsed/>
@@ -1262,11 +1945,11 @@
       <w:szCs w:val="22"/>
     </w:rPr>
   </w:style>
-  <w:style w:type="paragraph" w:styleId="Heading7">
+  <w:style w:type="paragraph" w:styleId="berschrift7">
     <w:name w:val="heading 7"/>
-    <w:basedOn w:val="Normal"/>
-    <w:next w:val="Normal"/>
-    <w:link w:val="Heading7Char"/>
+    <w:basedOn w:val="Standard"/>
+    <w:next w:val="Standard"/>
+    <w:link w:val="berschrift7Zchn"/>
     <w:uiPriority w:val="9"/>
     <w:semiHidden/>
     <w:unhideWhenUsed/>
@@ -1284,11 +1967,11 @@
       <w:szCs w:val="22"/>
     </w:rPr>
   </w:style>
-  <w:style w:type="paragraph" w:styleId="Heading8">
+  <w:style w:type="paragraph" w:styleId="berschrift8">
     <w:name w:val="heading 8"/>
-    <w:basedOn w:val="Normal"/>
-    <w:next w:val="Normal"/>
-    <w:link w:val="Heading8Char"/>
+    <w:basedOn w:val="Standard"/>
+    <w:next w:val="Standard"/>
+    <w:link w:val="berschrift8Zchn"/>
     <w:uiPriority w:val="9"/>
     <w:semiHidden/>
     <w:unhideWhenUsed/>
@@ -1306,11 +1989,11 @@
       <w:szCs w:val="22"/>
     </w:rPr>
   </w:style>
-  <w:style w:type="paragraph" w:styleId="Heading9">
+  <w:style w:type="paragraph" w:styleId="berschrift9">
     <w:name w:val="heading 9"/>
-    <w:basedOn w:val="Normal"/>
-    <w:next w:val="Normal"/>
-    <w:link w:val="Heading9Char"/>
+    <w:basedOn w:val="Standard"/>
+    <w:next w:val="Standard"/>
+    <w:link w:val="berschrift9Zchn"/>
     <w:uiPriority w:val="9"/>
     <w:semiHidden/>
     <w:unhideWhenUsed/>
@@ -1328,13 +2011,13 @@
       <w:sz w:val="20"/>
     </w:rPr>
   </w:style>
-  <w:style w:type="character" w:default="1" w:styleId="DefaultParagraphFont">
+  <w:style w:type="character" w:default="1" w:styleId="Absatz-Standardschriftart">
     <w:name w:val="Default Paragraph Font"/>
     <w:uiPriority w:val="1"/>
     <w:semiHidden/>
     <w:unhideWhenUsed/>
   </w:style>
-  <w:style w:type="table" w:default="1" w:styleId="TableNormal">
+  <w:style w:type="table" w:default="1" w:styleId="NormaleTabelle">
     <w:name w:val="Normal Table"/>
     <w:uiPriority w:val="99"/>
     <w:semiHidden/>
@@ -1349,16 +2032,16 @@
       </w:tblCellMar>
     </w:tblPr>
   </w:style>
-  <w:style w:type="numbering" w:default="1" w:styleId="NoList">
+  <w:style w:type="numbering" w:default="1" w:styleId="KeineListe">
     <w:name w:val="No List"/>
     <w:uiPriority w:val="99"/>
     <w:semiHidden/>
     <w:unhideWhenUsed/>
   </w:style>
-  <w:style w:type="character" w:customStyle="1" w:styleId="Heading1Char">
-    <w:name w:val="Heading 1 Char"/>
-    <w:basedOn w:val="DefaultParagraphFont"/>
-    <w:link w:val="Heading1"/>
+  <w:style w:type="character" w:customStyle="1" w:styleId="berschrift1Zchn">
+    <w:name w:val="Überschrift 1 Zchn"/>
+    <w:basedOn w:val="Absatz-Standardschriftart"/>
+    <w:link w:val="berschrift1"/>
     <w:uiPriority w:val="9"/>
     <w:rsid w:val="00046BEF"/>
     <w:rPr>
@@ -1370,12 +2053,11 @@
       <w:shd w:val="clear" w:color="auto" w:fill="4472C4" w:themeFill="accent1"/>
     </w:rPr>
   </w:style>
-  <w:style w:type="character" w:customStyle="1" w:styleId="Heading2Char">
-    <w:name w:val="Heading 2 Char"/>
-    <w:basedOn w:val="DefaultParagraphFont"/>
-    <w:link w:val="Heading2"/>
+  <w:style w:type="character" w:customStyle="1" w:styleId="berschrift2Zchn">
+    <w:name w:val="Überschrift 2 Zchn"/>
+    <w:basedOn w:val="Absatz-Standardschriftart"/>
+    <w:link w:val="berschrift2"/>
     <w:uiPriority w:val="9"/>
-    <w:semiHidden/>
     <w:rsid w:val="00046BEF"/>
     <w:rPr>
       <w:rFonts w:asciiTheme="majorHAnsi" w:eastAsiaTheme="majorEastAsia" w:hAnsiTheme="majorHAnsi" w:cstheme="majorBidi"/>
@@ -1400,12 +2082,11 @@
       </w14:textFill>
     </w:rPr>
   </w:style>
-  <w:style w:type="character" w:customStyle="1" w:styleId="Heading3Char">
-    <w:name w:val="Heading 3 Char"/>
-    <w:basedOn w:val="DefaultParagraphFont"/>
-    <w:link w:val="Heading3"/>
+  <w:style w:type="character" w:customStyle="1" w:styleId="berschrift3Zchn">
+    <w:name w:val="Überschrift 3 Zchn"/>
+    <w:basedOn w:val="Absatz-Standardschriftart"/>
+    <w:link w:val="berschrift3"/>
     <w:uiPriority w:val="9"/>
-    <w:semiHidden/>
     <w:rsid w:val="00046BEF"/>
     <w:rPr>
       <w:rFonts w:asciiTheme="majorHAnsi" w:eastAsiaTheme="majorEastAsia" w:hAnsiTheme="majorHAnsi" w:cstheme="majorBidi"/>
@@ -1418,12 +2099,11 @@
       <w:sz w:val="28"/>
     </w:rPr>
   </w:style>
-  <w:style w:type="character" w:customStyle="1" w:styleId="Heading4Char">
-    <w:name w:val="Heading 4 Char"/>
-    <w:basedOn w:val="DefaultParagraphFont"/>
-    <w:link w:val="Heading4"/>
+  <w:style w:type="character" w:customStyle="1" w:styleId="berschrift4Zchn">
+    <w:name w:val="Überschrift 4 Zchn"/>
+    <w:basedOn w:val="Absatz-Standardschriftart"/>
+    <w:link w:val="berschrift4"/>
     <w:uiPriority w:val="9"/>
-    <w:semiHidden/>
     <w:rsid w:val="00046BEF"/>
     <w:rPr>
       <w:rFonts w:asciiTheme="majorHAnsi" w:eastAsiaTheme="majorEastAsia" w:hAnsiTheme="majorHAnsi" w:cstheme="majorBidi"/>
@@ -1434,10 +2114,10 @@
       <w:sz w:val="24"/>
     </w:rPr>
   </w:style>
-  <w:style w:type="character" w:customStyle="1" w:styleId="Heading5Char">
-    <w:name w:val="Heading 5 Char"/>
-    <w:basedOn w:val="DefaultParagraphFont"/>
-    <w:link w:val="Heading5"/>
+  <w:style w:type="character" w:customStyle="1" w:styleId="berschrift5Zchn">
+    <w:name w:val="Überschrift 5 Zchn"/>
+    <w:basedOn w:val="Absatz-Standardschriftart"/>
+    <w:link w:val="berschrift5"/>
     <w:uiPriority w:val="9"/>
     <w:semiHidden/>
     <w:rsid w:val="00046BEF"/>
@@ -1449,10 +2129,10 @@
       <w:color w:val="C45911" w:themeColor="accent2" w:themeShade="BF"/>
     </w:rPr>
   </w:style>
-  <w:style w:type="character" w:customStyle="1" w:styleId="Heading6Char">
-    <w:name w:val="Heading 6 Char"/>
-    <w:basedOn w:val="DefaultParagraphFont"/>
-    <w:link w:val="Heading6"/>
+  <w:style w:type="character" w:customStyle="1" w:styleId="berschrift6Zchn">
+    <w:name w:val="Überschrift 6 Zchn"/>
+    <w:basedOn w:val="Absatz-Standardschriftart"/>
+    <w:link w:val="berschrift6"/>
     <w:uiPriority w:val="9"/>
     <w:semiHidden/>
     <w:rsid w:val="00046BEF"/>
@@ -1462,10 +2142,10 @@
       <w:color w:val="2F5496" w:themeColor="accent1" w:themeShade="BF"/>
     </w:rPr>
   </w:style>
-  <w:style w:type="character" w:customStyle="1" w:styleId="Heading7Char">
-    <w:name w:val="Heading 7 Char"/>
-    <w:basedOn w:val="DefaultParagraphFont"/>
-    <w:link w:val="Heading7"/>
+  <w:style w:type="character" w:customStyle="1" w:styleId="berschrift7Zchn">
+    <w:name w:val="Überschrift 7 Zchn"/>
+    <w:basedOn w:val="Absatz-Standardschriftart"/>
+    <w:link w:val="berschrift7"/>
     <w:uiPriority w:val="9"/>
     <w:semiHidden/>
     <w:rsid w:val="00046BEF"/>
@@ -1475,10 +2155,10 @@
       <w:color w:val="C45911" w:themeColor="accent2" w:themeShade="BF"/>
     </w:rPr>
   </w:style>
-  <w:style w:type="character" w:customStyle="1" w:styleId="Heading8Char">
-    <w:name w:val="Heading 8 Char"/>
-    <w:basedOn w:val="DefaultParagraphFont"/>
-    <w:link w:val="Heading8"/>
+  <w:style w:type="character" w:customStyle="1" w:styleId="berschrift8Zchn">
+    <w:name w:val="Überschrift 8 Zchn"/>
+    <w:basedOn w:val="Absatz-Standardschriftart"/>
+    <w:link w:val="berschrift8"/>
     <w:uiPriority w:val="9"/>
     <w:semiHidden/>
     <w:rsid w:val="00046BEF"/>
@@ -1488,10 +2168,10 @@
       <w:color w:val="4472C4" w:themeColor="accent1"/>
     </w:rPr>
   </w:style>
-  <w:style w:type="character" w:customStyle="1" w:styleId="Heading9Char">
-    <w:name w:val="Heading 9 Char"/>
-    <w:basedOn w:val="DefaultParagraphFont"/>
-    <w:link w:val="Heading9"/>
+  <w:style w:type="character" w:customStyle="1" w:styleId="berschrift9Zchn">
+    <w:name w:val="Überschrift 9 Zchn"/>
+    <w:basedOn w:val="Absatz-Standardschriftart"/>
+    <w:link w:val="berschrift9"/>
     <w:uiPriority w:val="9"/>
     <w:semiHidden/>
     <w:rsid w:val="00046BEF"/>
@@ -1504,10 +2184,10 @@
       <w:szCs w:val="21"/>
     </w:rPr>
   </w:style>
-  <w:style w:type="paragraph" w:styleId="Caption">
+  <w:style w:type="paragraph" w:styleId="Beschriftung">
     <w:name w:val="caption"/>
-    <w:basedOn w:val="Normal"/>
-    <w:next w:val="Normal"/>
+    <w:basedOn w:val="Standard"/>
+    <w:next w:val="Standard"/>
     <w:uiPriority w:val="35"/>
     <w:semiHidden/>
     <w:unhideWhenUsed/>
@@ -1521,11 +2201,11 @@
       <w:szCs w:val="18"/>
     </w:rPr>
   </w:style>
-  <w:style w:type="paragraph" w:styleId="Title">
+  <w:style w:type="paragraph" w:styleId="Titel">
     <w:name w:val="Title"/>
-    <w:basedOn w:val="Normal"/>
-    <w:next w:val="Normal"/>
-    <w:link w:val="TitleChar"/>
+    <w:basedOn w:val="Standard"/>
+    <w:next w:val="Standard"/>
+    <w:link w:val="TitelZchn"/>
     <w:uiPriority w:val="10"/>
     <w:qFormat/>
     <w:rsid w:val="00046BEF"/>
@@ -1551,10 +2231,10 @@
       </w14:textOutline>
     </w:rPr>
   </w:style>
-  <w:style w:type="character" w:customStyle="1" w:styleId="TitleChar">
-    <w:name w:val="Title Char"/>
-    <w:basedOn w:val="DefaultParagraphFont"/>
-    <w:link w:val="Title"/>
+  <w:style w:type="character" w:customStyle="1" w:styleId="TitelZchn">
+    <w:name w:val="Titel Zchn"/>
+    <w:basedOn w:val="Absatz-Standardschriftart"/>
+    <w:link w:val="Titel"/>
     <w:uiPriority w:val="10"/>
     <w:rsid w:val="00046BEF"/>
     <w:rPr>
@@ -1577,11 +2257,11 @@
       </w14:textOutline>
     </w:rPr>
   </w:style>
-  <w:style w:type="paragraph" w:styleId="Subtitle">
+  <w:style w:type="paragraph" w:styleId="Untertitel">
     <w:name w:val="Subtitle"/>
-    <w:basedOn w:val="Normal"/>
-    <w:next w:val="Normal"/>
-    <w:link w:val="SubtitleChar"/>
+    <w:basedOn w:val="Standard"/>
+    <w:next w:val="Standard"/>
+    <w:link w:val="UntertitelZchn"/>
     <w:uiPriority w:val="11"/>
     <w:qFormat/>
     <w:rsid w:val="00046BEF"/>
@@ -1596,10 +2276,10 @@
       <w:szCs w:val="24"/>
     </w:rPr>
   </w:style>
-  <w:style w:type="character" w:customStyle="1" w:styleId="SubtitleChar">
-    <w:name w:val="Subtitle Char"/>
-    <w:basedOn w:val="DefaultParagraphFont"/>
-    <w:link w:val="Subtitle"/>
+  <w:style w:type="character" w:customStyle="1" w:styleId="UntertitelZchn">
+    <w:name w:val="Untertitel Zchn"/>
+    <w:basedOn w:val="Absatz-Standardschriftart"/>
+    <w:link w:val="Untertitel"/>
     <w:uiPriority w:val="11"/>
     <w:rsid w:val="00046BEF"/>
     <w:rPr>
@@ -1611,7 +2291,7 @@
       <w:szCs w:val="24"/>
     </w:rPr>
   </w:style>
-  <w:style w:type="character" w:styleId="Strong">
+  <w:style w:type="character" w:styleId="Fett">
     <w:name w:val="Strong"/>
     <w:uiPriority w:val="22"/>
     <w:qFormat/>
@@ -1622,7 +2302,7 @@
       <w:spacing w:val="0"/>
     </w:rPr>
   </w:style>
-  <w:style w:type="character" w:styleId="Emphasis">
+  <w:style w:type="character" w:styleId="Hervorhebung">
     <w:name w:val="Emphasis"/>
     <w:uiPriority w:val="20"/>
     <w:qFormat/>
@@ -1636,10 +2316,10 @@
       <w:shd w:val="clear" w:color="auto" w:fill="E7E6E6" w:themeFill="background2"/>
     </w:rPr>
   </w:style>
-  <w:style w:type="paragraph" w:styleId="NoSpacing">
+  <w:style w:type="paragraph" w:styleId="KeinLeerraum">
     <w:name w:val="No Spacing"/>
-    <w:basedOn w:val="Normal"/>
-    <w:link w:val="NoSpacingChar"/>
+    <w:basedOn w:val="Standard"/>
+    <w:link w:val="KeinLeerraumZchn"/>
     <w:uiPriority w:val="1"/>
     <w:qFormat/>
     <w:rsid w:val="00046BEF"/>
@@ -1647,10 +2327,10 @@
       <w:spacing w:after="0" w:line="240" w:lineRule="auto"/>
     </w:pPr>
   </w:style>
-  <w:style w:type="character" w:customStyle="1" w:styleId="NoSpacingChar">
-    <w:name w:val="No Spacing Char"/>
-    <w:basedOn w:val="DefaultParagraphFont"/>
-    <w:link w:val="NoSpacing"/>
+  <w:style w:type="character" w:customStyle="1" w:styleId="KeinLeerraumZchn">
+    <w:name w:val="Kein Leerraum Zchn"/>
+    <w:basedOn w:val="Absatz-Standardschriftart"/>
+    <w:link w:val="KeinLeerraum"/>
     <w:uiPriority w:val="1"/>
     <w:rsid w:val="00046BEF"/>
     <w:rPr>
@@ -1659,9 +2339,9 @@
       <w:szCs w:val="21"/>
     </w:rPr>
   </w:style>
-  <w:style w:type="paragraph" w:styleId="ListParagraph">
+  <w:style w:type="paragraph" w:styleId="Listenabsatz">
     <w:name w:val="List Paragraph"/>
-    <w:basedOn w:val="Normal"/>
+    <w:basedOn w:val="Standard"/>
     <w:uiPriority w:val="34"/>
     <w:qFormat/>
     <w:rsid w:val="00046BEF"/>
@@ -1675,11 +2355,11 @@
       <w:sz w:val="22"/>
     </w:rPr>
   </w:style>
-  <w:style w:type="paragraph" w:styleId="Quote">
+  <w:style w:type="paragraph" w:styleId="Zitat">
     <w:name w:val="Quote"/>
-    <w:basedOn w:val="Normal"/>
-    <w:next w:val="Normal"/>
-    <w:link w:val="QuoteChar"/>
+    <w:basedOn w:val="Standard"/>
+    <w:next w:val="Standard"/>
+    <w:link w:val="ZitatZchn"/>
     <w:uiPriority w:val="29"/>
     <w:qFormat/>
     <w:rsid w:val="00046BEF"/>
@@ -1690,10 +2370,10 @@
       <w:sz w:val="24"/>
     </w:rPr>
   </w:style>
-  <w:style w:type="character" w:customStyle="1" w:styleId="QuoteChar">
-    <w:name w:val="Quote Char"/>
-    <w:basedOn w:val="DefaultParagraphFont"/>
-    <w:link w:val="Quote"/>
+  <w:style w:type="character" w:customStyle="1" w:styleId="ZitatZchn">
+    <w:name w:val="Zitat Zchn"/>
+    <w:basedOn w:val="Absatz-Standardschriftart"/>
+    <w:link w:val="Zitat"/>
     <w:uiPriority w:val="29"/>
     <w:rsid w:val="00046BEF"/>
     <w:rPr>
@@ -1705,11 +2385,11 @@
       <w:szCs w:val="21"/>
     </w:rPr>
   </w:style>
-  <w:style w:type="paragraph" w:styleId="IntenseQuote">
+  <w:style w:type="paragraph" w:styleId="IntensivesZitat">
     <w:name w:val="Intense Quote"/>
-    <w:basedOn w:val="Normal"/>
-    <w:next w:val="Normal"/>
-    <w:link w:val="IntenseQuoteChar"/>
+    <w:basedOn w:val="Standard"/>
+    <w:next w:val="Standard"/>
+    <w:link w:val="IntensivesZitatZchn"/>
     <w:uiPriority w:val="30"/>
     <w:qFormat/>
     <w:rsid w:val="00046BEF"/>
@@ -1732,10 +2412,10 @@
       <w:szCs w:val="20"/>
     </w:rPr>
   </w:style>
-  <w:style w:type="character" w:customStyle="1" w:styleId="IntenseQuoteChar">
-    <w:name w:val="Intense Quote Char"/>
-    <w:basedOn w:val="DefaultParagraphFont"/>
-    <w:link w:val="IntenseQuote"/>
+  <w:style w:type="character" w:customStyle="1" w:styleId="IntensivesZitatZchn">
+    <w:name w:val="Intensives Zitat Zchn"/>
+    <w:basedOn w:val="Absatz-Standardschriftart"/>
+    <w:link w:val="IntensivesZitat"/>
     <w:uiPriority w:val="30"/>
     <w:rsid w:val="00046BEF"/>
     <w:rPr>
@@ -1749,7 +2429,7 @@
       <w:szCs w:val="20"/>
     </w:rPr>
   </w:style>
-  <w:style w:type="character" w:styleId="SubtleEmphasis">
+  <w:style w:type="character" w:styleId="SchwacheHervorhebung">
     <w:name w:val="Subtle Emphasis"/>
     <w:uiPriority w:val="19"/>
     <w:qFormat/>
@@ -1761,7 +2441,7 @@
       <w:color w:val="4472C4" w:themeColor="accent1"/>
     </w:rPr>
   </w:style>
-  <w:style w:type="character" w:styleId="IntenseEmphasis">
+  <w:style w:type="character" w:styleId="IntensiveHervorhebung">
     <w:name w:val="Intense Emphasis"/>
     <w:uiPriority w:val="21"/>
     <w:qFormat/>
@@ -1779,7 +2459,7 @@
       <w:vertAlign w:val="baseline"/>
     </w:rPr>
   </w:style>
-  <w:style w:type="character" w:styleId="SubtleReference">
+  <w:style w:type="character" w:styleId="SchwacherVerweis">
     <w:name w:val="Subtle Reference"/>
     <w:uiPriority w:val="31"/>
     <w:qFormat/>
@@ -1792,7 +2472,7 @@
       <w:u w:color="ED7D31" w:themeColor="accent2"/>
     </w:rPr>
   </w:style>
-  <w:style w:type="character" w:styleId="IntenseReference">
+  <w:style w:type="character" w:styleId="IntensiverVerweis">
     <w:name w:val="Intense Reference"/>
     <w:uiPriority w:val="32"/>
     <w:qFormat/>
@@ -1807,7 +2487,7 @@
       <w:u w:color="ED7D31" w:themeColor="accent2"/>
     </w:rPr>
   </w:style>
-  <w:style w:type="character" w:styleId="BookTitle">
+  <w:style w:type="character" w:styleId="Buchtitel">
     <w:name w:val="Book Title"/>
     <w:uiPriority w:val="33"/>
     <w:qFormat/>
@@ -1821,10 +2501,10 @@
       <w:u w:val="single"/>
     </w:rPr>
   </w:style>
-  <w:style w:type="paragraph" w:styleId="TOCHeading">
+  <w:style w:type="paragraph" w:styleId="Inhaltsverzeichnisberschrift">
     <w:name w:val="TOC Heading"/>
-    <w:basedOn w:val="Heading1"/>
-    <w:next w:val="Normal"/>
+    <w:basedOn w:val="berschrift1"/>
+    <w:next w:val="Standard"/>
     <w:uiPriority w:val="39"/>
     <w:semiHidden/>
     <w:unhideWhenUsed/>

</xml_diff>